<commit_message>
docs: add Song paper figures to comparison report
</commit_message>
<xml_diff>
--- a/output/doc/Song文献模型_FEniCSx_empymod_SimPEG_三维时域正演对比报告.docx
+++ b/output/doc/Song文献模型_FEniCSx_empymod_SimPEG_三维时域正演对比报告.docx
@@ -710,6 +710,239 @@
     </w:p>
     <w:p>
       <w:pPr>
+        <w:pStyle w:val="Heading2"/>
+      </w:pPr>
+      <w:r>
+        <w:t>3.1 Song文献原图及与本次算例的对应关系</w:t>
+      </w:r>
+    </w:p>
+    <w:p>
+      <w:r>
+        <w:t>以下四幅图直接摘自Song等（2025）原文，用于说明论文中的SOTEM装置、三维模型及极化响应。它们与前面的报告重绘图用途不同：文献原图用于追溯模型出处，报告图1用于清楚表达本次实际计算坐标和参数。文献原图均保留论文图号，并在本报告题注中给出出处；不得将其视为FEniCSx、empymod或SimPEG的新计算结果。</w:t>
+      </w:r>
+    </w:p>
+    <w:p>
+      <w:pPr>
+        <w:keepNext/>
+        <w:jc w:val="center"/>
+      </w:pPr>
+      <w:r>
+        <w:drawing>
+          <wp:inline xmlns:a="http://schemas.openxmlformats.org/drawingml/2006/main" xmlns:pic="http://schemas.openxmlformats.org/drawingml/2006/picture">
+            <wp:extent cx="4140000" cy="3603333"/>
+            <wp:docPr id="2" name="Picture 2"/>
+            <wp:cNvGraphicFramePr>
+              <a:graphicFrameLocks noChangeAspect="1"/>
+            </wp:cNvGraphicFramePr>
+            <a:graphic>
+              <a:graphicData uri="http://schemas.openxmlformats.org/drawingml/2006/picture">
+                <pic:pic>
+                  <pic:nvPicPr>
+                    <pic:cNvPr id="0" name="song2025_fig1_layout.png"/>
+                    <pic:cNvPicPr/>
+                  </pic:nvPicPr>
+                  <pic:blipFill>
+                    <a:blip r:embed="rId12"/>
+                    <a:stretch>
+                      <a:fillRect/>
+                    </a:stretch>
+                  </pic:blipFill>
+                  <pic:spPr>
+                    <a:xfrm>
+                      <a:off x="0" y="0"/>
+                      <a:ext cx="4140000" cy="3603333"/>
+                    </a:xfrm>
+                    <a:prstGeom prst="rect"/>
+                  </pic:spPr>
+                </pic:pic>
+              </a:graphicData>
+            </a:graphic>
+          </wp:inline>
+        </w:drawing>
+      </w:r>
+    </w:p>
+    <w:p>
+      <w:pPr>
+        <w:pStyle w:val="Caption"/>
+        <w:keepNext/>
+        <w:jc w:val="center"/>
+      </w:pPr>
+      <w:r>
+        <w:t>文献原图1  Song等（2025）图1：SOTEM方法示意图。该图是论文的通用装置示意，不是本项目真实堤坝装置。来源：Journal of Applied Geophysics 233 (2025) 105613，DOI: 10.1016/j.jappgeo.2024.105613。</w:t>
+      </w:r>
+    </w:p>
+    <w:p>
+      <w:r>
+        <w:br w:type="page"/>
+      </w:r>
+    </w:p>
+    <w:p>
+      <w:pPr>
+        <w:keepNext/>
+        <w:jc w:val="center"/>
+      </w:pPr>
+      <w:r>
+        <w:drawing>
+          <wp:inline xmlns:a="http://schemas.openxmlformats.org/drawingml/2006/main" xmlns:pic="http://schemas.openxmlformats.org/drawingml/2006/picture">
+            <wp:extent cx="4860000" cy="4102018"/>
+            <wp:docPr id="3" name="Picture 3"/>
+            <wp:cNvGraphicFramePr>
+              <a:graphicFrameLocks noChangeAspect="1"/>
+            </wp:cNvGraphicFramePr>
+            <a:graphic>
+              <a:graphicData uri="http://schemas.openxmlformats.org/drawingml/2006/picture">
+                <pic:pic>
+                  <pic:nvPicPr>
+                    <pic:cNvPr id="0" name="song2025_fig4_model.png"/>
+                    <pic:cNvPicPr/>
+                  </pic:nvPicPr>
+                  <pic:blipFill>
+                    <a:blip r:embed="rId13"/>
+                    <a:stretch>
+                      <a:fillRect/>
+                    </a:stretch>
+                  </pic:blipFill>
+                  <pic:spPr>
+                    <a:xfrm>
+                      <a:off x="0" y="0"/>
+                      <a:ext cx="4860000" cy="4102018"/>
+                    </a:xfrm>
+                    <a:prstGeom prst="rect"/>
+                  </pic:spPr>
+                </pic:pic>
+              </a:graphicData>
+            </a:graphic>
+          </wp:inline>
+        </w:drawing>
+      </w:r>
+    </w:p>
+    <w:p>
+      <w:pPr>
+        <w:pStyle w:val="Caption"/>
+        <w:keepNext/>
+        <w:jc w:val="center"/>
+      </w:pPr>
+      <w:r>
+        <w:t>文献原图2  Song等（2025）图4：三维正演模型网格，中间层为极化层。本次交叉验证采用该组层状极化模型框架，并通过算例文件固定实际坐标和参数。来源同上。</w:t>
+      </w:r>
+    </w:p>
+    <w:p>
+      <w:r>
+        <w:br w:type="page"/>
+      </w:r>
+    </w:p>
+    <w:p>
+      <w:pPr>
+        <w:keepNext/>
+        <w:jc w:val="center"/>
+      </w:pPr>
+      <w:r>
+        <w:drawing>
+          <wp:inline xmlns:a="http://schemas.openxmlformats.org/drawingml/2006/main" xmlns:pic="http://schemas.openxmlformats.org/drawingml/2006/picture">
+            <wp:extent cx="5832000" cy="3631904"/>
+            <wp:docPr id="4" name="Picture 4"/>
+            <wp:cNvGraphicFramePr>
+              <a:graphicFrameLocks noChangeAspect="1"/>
+            </wp:cNvGraphicFramePr>
+            <a:graphic>
+              <a:graphicData uri="http://schemas.openxmlformats.org/drawingml/2006/picture">
+                <pic:pic>
+                  <pic:nvPicPr>
+                    <pic:cNvPr id="0" name="song2025_fig7_ex.png"/>
+                    <pic:cNvPicPr/>
+                  </pic:nvPicPr>
+                  <pic:blipFill>
+                    <a:blip r:embed="rId14"/>
+                    <a:stretch>
+                      <a:fillRect/>
+                    </a:stretch>
+                  </pic:blipFill>
+                  <pic:spPr>
+                    <a:xfrm>
+                      <a:off x="0" y="0"/>
+                      <a:ext cx="5832000" cy="3631904"/>
+                    </a:xfrm>
+                    <a:prstGeom prst="rect"/>
+                  </pic:spPr>
+                </pic:pic>
+              </a:graphicData>
+            </a:graphic>
+          </wp:inline>
+        </w:drawing>
+      </w:r>
+    </w:p>
+    <w:p>
+      <w:pPr>
+        <w:pStyle w:val="Caption"/>
+        <w:keepNext/>
+        <w:jc w:val="center"/>
+      </w:pPr>
+      <w:r>
+        <w:t>文献原图3  Song等（2025）图7：有极化与无极化条件下的Ex响应及相对极化效应。论文图覆盖10 μs-1 s；本报告的正式数值验收只覆盖10 μs-1 ms。来源同上。</w:t>
+      </w:r>
+    </w:p>
+    <w:p>
+      <w:r>
+        <w:br w:type="page"/>
+      </w:r>
+    </w:p>
+    <w:p>
+      <w:pPr>
+        <w:keepNext/>
+        <w:jc w:val="center"/>
+      </w:pPr>
+      <w:r>
+        <w:drawing>
+          <wp:inline xmlns:a="http://schemas.openxmlformats.org/drawingml/2006/main" xmlns:pic="http://schemas.openxmlformats.org/drawingml/2006/picture">
+            <wp:extent cx="5832000" cy="3439832"/>
+            <wp:docPr id="5" name="Picture 5"/>
+            <wp:cNvGraphicFramePr>
+              <a:graphicFrameLocks noChangeAspect="1"/>
+            </wp:cNvGraphicFramePr>
+            <a:graphic>
+              <a:graphicData uri="http://schemas.openxmlformats.org/drawingml/2006/picture">
+                <pic:pic>
+                  <pic:nvPicPr>
+                    <pic:cNvPr id="0" name="song2025_fig8_hz.png"/>
+                    <pic:cNvPicPr/>
+                  </pic:nvPicPr>
+                  <pic:blipFill>
+                    <a:blip r:embed="rId15"/>
+                    <a:stretch>
+                      <a:fillRect/>
+                    </a:stretch>
+                  </pic:blipFill>
+                  <pic:spPr>
+                    <a:xfrm>
+                      <a:off x="0" y="0"/>
+                      <a:ext cx="5832000" cy="3439832"/>
+                    </a:xfrm>
+                    <a:prstGeom prst="rect"/>
+                  </pic:spPr>
+                </pic:pic>
+              </a:graphicData>
+            </a:graphic>
+          </wp:inline>
+        </w:drawing>
+      </w:r>
+    </w:p>
+    <w:p>
+      <w:pPr>
+        <w:pStyle w:val="Caption"/>
+        <w:keepNext/>
+        <w:jc w:val="center"/>
+      </w:pPr>
+      <w:r>
+        <w:t>文献原图4  Song等（2025）图8：有极化与无极化条件下的Hz响应及相对极化效应。论文图覆盖10 μs-1 s；本报告的正式数值验收只覆盖10 μs-1 ms。来源同上。</w:t>
+      </w:r>
+    </w:p>
+    <w:p>
+      <w:r>
+        <w:t>文献图7和图8用于核对响应形态、符号变化和极化效应随时间的总体规律，不作为本报告逐点误差的数字化数据源。本报告的empymod参考值由同一有限线源、层状电阻率和Cole-Cole参数独立计算。此外，Song文献图7和图8直接给出Ex与Hz；与感应线圈电压成正比的dBz/dt由Faraday关系独立计算并在后文对比。</w:t>
+      </w:r>
+    </w:p>
+    <w:p>
+      <w:pPr>
         <w:pStyle w:val="Heading1"/>
       </w:pPr>
       <w:r>
@@ -4751,7 +4984,7 @@
         <w:drawing>
           <wp:inline xmlns:a="http://schemas.openxmlformats.org/drawingml/2006/main" xmlns:pic="http://schemas.openxmlformats.org/drawingml/2006/picture">
             <wp:extent cx="6048000" cy="4860000"/>
-            <wp:docPr id="2" name="Picture 2"/>
+            <wp:docPr id="6" name="Picture 6"/>
             <wp:cNvGraphicFramePr>
               <a:graphicFrameLocks noChangeAspect="1"/>
             </wp:cNvGraphicFramePr>
@@ -4763,7 +4996,7 @@
                     <pic:cNvPicPr/>
                   </pic:nvPicPr>
                   <pic:blipFill>
-                    <a:blip r:embed="rId12"/>
+                    <a:blip r:embed="rId16"/>
                     <a:stretch>
                       <a:fillRect/>
                     </a:stretch>
@@ -4814,7 +5047,7 @@
         <w:drawing>
           <wp:inline xmlns:a="http://schemas.openxmlformats.org/drawingml/2006/main" xmlns:pic="http://schemas.openxmlformats.org/drawingml/2006/picture">
             <wp:extent cx="5976000" cy="2137601"/>
-            <wp:docPr id="3" name="Picture 3"/>
+            <wp:docPr id="7" name="Picture 7"/>
             <wp:cNvGraphicFramePr>
               <a:graphicFrameLocks noChangeAspect="1"/>
             </wp:cNvGraphicFramePr>
@@ -4826,7 +5059,7 @@
                     <pic:cNvPicPr/>
                   </pic:nvPicPr>
                   <pic:blipFill>
-                    <a:blip r:embed="rId13"/>
+                    <a:blip r:embed="rId17"/>
                     <a:stretch>
                       <a:fillRect/>
                     </a:stretch>
@@ -4864,7 +5097,7 @@
         <w:drawing>
           <wp:inline xmlns:a="http://schemas.openxmlformats.org/drawingml/2006/main" xmlns:pic="http://schemas.openxmlformats.org/drawingml/2006/picture">
             <wp:extent cx="5976000" cy="2135649"/>
-            <wp:docPr id="4" name="Picture 4"/>
+            <wp:docPr id="8" name="Picture 8"/>
             <wp:cNvGraphicFramePr>
               <a:graphicFrameLocks noChangeAspect="1"/>
             </wp:cNvGraphicFramePr>
@@ -4876,7 +5109,7 @@
                     <pic:cNvPicPr/>
                   </pic:nvPicPr>
                   <pic:blipFill>
-                    <a:blip r:embed="rId14"/>
+                    <a:blip r:embed="rId18"/>
                     <a:stretch>
                       <a:fillRect/>
                     </a:stretch>
@@ -5837,7 +6070,7 @@
         <w:drawing>
           <wp:inline xmlns:a="http://schemas.openxmlformats.org/drawingml/2006/main" xmlns:pic="http://schemas.openxmlformats.org/drawingml/2006/picture">
             <wp:extent cx="5976000" cy="2137601"/>
-            <wp:docPr id="5" name="Picture 5"/>
+            <wp:docPr id="9" name="Picture 9"/>
             <wp:cNvGraphicFramePr>
               <a:graphicFrameLocks noChangeAspect="1"/>
             </wp:cNvGraphicFramePr>
@@ -5849,7 +6082,7 @@
                     <pic:cNvPicPr/>
                   </pic:nvPicPr>
                   <pic:blipFill>
-                    <a:blip r:embed="rId15"/>
+                    <a:blip r:embed="rId19"/>
                     <a:stretch>
                       <a:fillRect/>
                     </a:stretch>
@@ -5887,7 +6120,7 @@
         <w:drawing>
           <wp:inline xmlns:a="http://schemas.openxmlformats.org/drawingml/2006/main" xmlns:pic="http://schemas.openxmlformats.org/drawingml/2006/picture">
             <wp:extent cx="5976000" cy="2135649"/>
-            <wp:docPr id="6" name="Picture 6"/>
+            <wp:docPr id="10" name="Picture 10"/>
             <wp:cNvGraphicFramePr>
               <a:graphicFrameLocks noChangeAspect="1"/>
             </wp:cNvGraphicFramePr>
@@ -5899,7 +6132,7 @@
                     <pic:cNvPicPr/>
                   </pic:nvPicPr>
                   <pic:blipFill>
-                    <a:blip r:embed="rId16"/>
+                    <a:blip r:embed="rId20"/>
                     <a:stretch>
                       <a:fillRect/>
                     </a:stretch>
@@ -6865,7 +7098,7 @@
         <w:drawing>
           <wp:inline xmlns:a="http://schemas.openxmlformats.org/drawingml/2006/main" xmlns:pic="http://schemas.openxmlformats.org/drawingml/2006/picture">
             <wp:extent cx="5976000" cy="2171852"/>
-            <wp:docPr id="7" name="Picture 7"/>
+            <wp:docPr id="11" name="Picture 11"/>
             <wp:cNvGraphicFramePr>
               <a:graphicFrameLocks noChangeAspect="1"/>
             </wp:cNvGraphicFramePr>
@@ -6877,7 +7110,7 @@
                     <pic:cNvPicPr/>
                   </pic:nvPicPr>
                   <pic:blipFill>
-                    <a:blip r:embed="rId17"/>
+                    <a:blip r:embed="rId21"/>
                     <a:stretch>
                       <a:fillRect/>
                     </a:stretch>
@@ -7204,7 +7437,7 @@
         <w:drawing>
           <wp:inline xmlns:a="http://schemas.openxmlformats.org/drawingml/2006/main" xmlns:pic="http://schemas.openxmlformats.org/drawingml/2006/picture">
             <wp:extent cx="5976000" cy="2691716"/>
-            <wp:docPr id="8" name="Picture 8"/>
+            <wp:docPr id="12" name="Picture 12"/>
             <wp:cNvGraphicFramePr>
               <a:graphicFrameLocks noChangeAspect="1"/>
             </wp:cNvGraphicFramePr>
@@ -7216,7 +7449,7 @@
                     <pic:cNvPicPr/>
                   </pic:nvPicPr>
                   <pic:blipFill>
-                    <a:blip r:embed="rId18"/>
+                    <a:blip r:embed="rId22"/>
                     <a:stretch>
                       <a:fillRect/>
                     </a:stretch>

</xml_diff>